<commit_message>
fix: revert extra fuel page and map all articles to existing solution pillars
</commit_message>
<xml_diff>
--- a/40_ARTICLES/WizIOT_40_Articles_Final.docx
+++ b/40_ARTICLES/WizIOT_40_Articles_Final.docx
@@ -1501,7 +1501,7 @@
         </w:rPr>
         <w:t xml:space="preserve">When deploying these capabilities across commercial operations, teams using </w:t>
       </w:r>
-      <w:hyperlink w:history="1" r:id="rIdgt9cetpxyclh9dhc27wh6">
+      <w:hyperlink w:history="1" r:id="rIdyysh0nsga78fp6dsavumz">
         <w:r>
           <w:rPr>
             <w:rStyle w:val="Hyperlink"/>
@@ -1519,7 +1519,7 @@
         </w:rPr>
         <w:t xml:space="preserve"> combine CAN bus diagnostics with real-time fuel monitoring. To see how these tools fit your operational workflows, explore our </w:t>
       </w:r>
-      <w:hyperlink w:history="1" r:id="rIddrssrg2jhdpri-uec04ec">
+      <w:hyperlink w:history="1" r:id="rIdr0l8h-3dd0cpvdf8s7r_j">
         <w:r>
           <w:rPr>
             <w:rStyle w:val="Hyperlink"/>
@@ -1944,7 +1944,7 @@
         </w:rPr>
         <w:t xml:space="preserve">Before committing to long-term contracts, evaluate how </w:t>
       </w:r>
-      <w:hyperlink w:history="1" r:id="rIdmph-7pl5htruxnhim3mjv">
+      <w:hyperlink w:history="1" r:id="rIdawqn7dt2qoxmfvxld-gey">
         <w:r>
           <w:rPr>
             <w:rStyle w:val="Hyperlink"/>
@@ -1962,7 +1962,7 @@
         </w:rPr>
         <w:t xml:space="preserve"> supports hardware-agnostic tracking and multi-network roaming. You can </w:t>
       </w:r>
-      <w:hyperlink w:history="1" r:id="rIdozmcsma-73bz7lkgr0srf">
+      <w:hyperlink w:history="1" r:id="rIdveatagvzshayjp8jr3cie">
         <w:r>
           <w:rPr>
             <w:rStyle w:val="Hyperlink"/>
@@ -2387,7 +2387,7 @@
         </w:rPr>
         <w:t xml:space="preserve">By pairing live GNSS positioning with automated dispatching, </w:t>
       </w:r>
-      <w:hyperlink w:history="1" r:id="rIdhva0balh1o22j-t71khoy">
+      <w:hyperlink w:history="1" r:id="rIda0c_2isqzoawl56hjr3hi">
         <w:r>
           <w:rPr>
             <w:rStyle w:val="Hyperlink"/>
@@ -2405,7 +2405,7 @@
         </w:rPr>
         <w:t xml:space="preserve"> eliminates delivery blind spots. Learn how these tools scale across your fleet by reviewing the </w:t>
       </w:r>
-      <w:hyperlink w:history="1" r:id="rIdsdenkysfntxa-yqyaq39a">
+      <w:hyperlink w:history="1" r:id="rIdy-4czw_cx2pl2vnovkmxd">
         <w:r>
           <w:rPr>
             <w:rStyle w:val="Hyperlink"/>
@@ -2830,7 +2830,7 @@
         </w:rPr>
         <w:t xml:space="preserve">Getting started with professional fleet tracking is straightforward. Check out </w:t>
       </w:r>
-      <w:hyperlink w:history="1" r:id="rIdhmo0jrlklstxvrcc0pagu">
+      <w:hyperlink w:history="1" r:id="rId3r0uvgvszticnubkxualy">
         <w:r>
           <w:rPr>
             <w:rStyle w:val="Hyperlink"/>
@@ -2848,7 +2848,7 @@
         </w:rPr>
         <w:t xml:space="preserve"> or </w:t>
       </w:r>
-      <w:hyperlink w:history="1" r:id="rIdz3c8ccr6mf9ozdyfx2jng">
+      <w:hyperlink w:history="1" r:id="rIdbmm9rsxfk3htbju-guc4w">
         <w:r>
           <w:rPr>
             <w:rStyle w:val="Hyperlink"/>
@@ -3273,7 +3273,7 @@
         </w:rPr>
         <w:t xml:space="preserve">Discover how </w:t>
       </w:r>
-      <w:hyperlink w:history="1" r:id="rIdmlln1w1gxisilxkt3qs6p">
+      <w:hyperlink w:history="1" r:id="rIdvojvul18bxlmxh6pmvc_7">
         <w:r>
           <w:rPr>
             <w:rStyle w:val="Hyperlink"/>
@@ -3291,7 +3291,7 @@
         </w:rPr>
         <w:t xml:space="preserve"> unifies engine diagnostic data and real-time positioning, or browse our </w:t>
       </w:r>
-      <w:hyperlink w:history="1" r:id="rIdmgum4ggrqnczjjtroezz4">
+      <w:hyperlink w:history="1" r:id="rId1ndz9murf0lllwwre2ioc">
         <w:r>
           <w:rPr>
             <w:rStyle w:val="Hyperlink"/>
@@ -3716,7 +3716,7 @@
         </w:rPr>
         <w:t xml:space="preserve">Stop reacting to unexpected roadside breakdowns. Explore how </w:t>
       </w:r>
-      <w:hyperlink w:history="1" r:id="rIdtue-tifglbvq9do1dgtzn">
+      <w:hyperlink w:history="1" r:id="rIdyi6wiq68vpq_-k8i0wyse">
         <w:r>
           <w:rPr>
             <w:rStyle w:val="Hyperlink"/>
@@ -3734,7 +3734,7 @@
         </w:rPr>
         <w:t xml:space="preserve"> automate vehicle health tracking, or </w:t>
       </w:r>
-      <w:hyperlink w:history="1" r:id="rIdluoo5-pbmdbvppodh9kko">
+      <w:hyperlink w:history="1" r:id="rIdcs0h5mdkktl2pwfow6stg">
         <w:r>
           <w:rPr>
             <w:rStyle w:val="Hyperlink"/>
@@ -4159,7 +4159,7 @@
         </w:rPr>
         <w:t xml:space="preserve">Protect your drivers and reduce insurance liabilities with </w:t>
       </w:r>
-      <w:hyperlink w:history="1" r:id="rId1co1j_bukahtchlmpj6kl">
+      <w:hyperlink w:history="1" r:id="rIdx7eomfjunufaubqusiqup">
         <w:r>
           <w:rPr>
             <w:rStyle w:val="Hyperlink"/>
@@ -4177,7 +4177,7 @@
         </w:rPr>
         <w:t xml:space="preserve">. For platform specifications and hardware integration options, visit the </w:t>
       </w:r>
-      <w:hyperlink w:history="1" r:id="rIdy-ao06tyedzhr5vdkugmp">
+      <w:hyperlink w:history="1" r:id="rIde7lqv7u3wgc8vom5r_lza">
         <w:r>
           <w:rPr>
             <w:rStyle w:val="Hyperlink"/>
@@ -4602,7 +4602,7 @@
         </w:rPr>
         <w:t xml:space="preserve">Cutting unmonitored idle time delivers immediate bottom-line savings. See how </w:t>
       </w:r>
-      <w:hyperlink w:history="1" r:id="rIdc-kyttqwds5oe4zv9ao47">
+      <w:hyperlink w:history="1" r:id="rId3s07g51gvxqj5gboyp3ky">
         <w:r>
           <w:rPr>
             <w:rStyle w:val="Hyperlink"/>
@@ -4620,7 +4620,7 @@
         </w:rPr>
         <w:t xml:space="preserve"> automates idle reporting, or review our </w:t>
       </w:r>
-      <w:hyperlink w:history="1" r:id="rId34wsi_tios6w5xtvz-cce">
+      <w:hyperlink w:history="1" r:id="rIdketimxn3xawt-f_lfkrss">
         <w:r>
           <w:rPr>
             <w:rStyle w:val="Hyperlink"/>
@@ -5045,14 +5045,14 @@
         </w:rPr>
         <w:t xml:space="preserve">Close the loop on diesel expenses by deploying </w:t>
       </w:r>
-      <w:hyperlink w:history="1" r:id="rIduo1jxmz0nbr04b4wkblqg">
+      <w:hyperlink w:history="1" r:id="rIdoa8ejpuqxtozqcl946dcx">
         <w:r>
           <w:rPr>
             <w:rStyle w:val="Hyperlink"/>
             <w:color w:val="0169A9"/>
             <w:u w:val="single"/>
           </w:rPr>
-          <w:t xml:space="preserve">WizIOT's fuel management software</w:t>
+          <w:t xml:space="preserve">WizIOT's fleet fuel management analytics</w:t>
         </w:r>
       </w:hyperlink>
       <w:r>
@@ -5063,7 +5063,7 @@
         </w:rPr>
         <w:t xml:space="preserve">, or integrate heavy machinery fuel logging through our </w:t>
       </w:r>
-      <w:hyperlink w:history="1" r:id="rId50myr_lpjrypar9xlcw6k">
+      <w:hyperlink w:history="1" r:id="rIdrmijp0qyduldmpehitvt3">
         <w:r>
           <w:rPr>
             <w:rStyle w:val="Hyperlink"/>
@@ -5488,14 +5488,14 @@
         </w:rPr>
         <w:t xml:space="preserve">Manage cross-border fuel budgets and dual-tank heavy haulers with </w:t>
       </w:r>
-      <w:hyperlink w:history="1" r:id="rIdgtk3l0znadtua-zgwfrkn">
+      <w:hyperlink w:history="1" r:id="rId53350zckxll2xmvexebkk">
         <w:r>
           <w:rPr>
             <w:rStyle w:val="Hyperlink"/>
             <w:color w:val="0169A9"/>
             <w:u w:val="single"/>
           </w:rPr>
-          <w:t xml:space="preserve">WizIOT's enterprise fuel management software</w:t>
+          <w:t xml:space="preserve">WizIOT's commercial telematics</w:t>
         </w:r>
       </w:hyperlink>
       <w:r>
@@ -5506,7 +5506,7 @@
         </w:rPr>
         <w:t xml:space="preserve">, or </w:t>
       </w:r>
-      <w:hyperlink w:history="1" r:id="rIdleto0fccx32nixxlczc-v">
+      <w:hyperlink w:history="1" r:id="rIdzzfgbvu8va9a-kzemzpze">
         <w:r>
           <w:rPr>
             <w:rStyle w:val="Hyperlink"/>
@@ -5931,14 +5931,14 @@
         </w:rPr>
         <w:t xml:space="preserve">Equip your fleet with high-precision sensors through </w:t>
       </w:r>
-      <w:hyperlink w:history="1" r:id="rId_oltf2feksjtjsrymqbng">
+      <w:hyperlink w:history="1" r:id="rIdkdy7eabanxlaasybtvyki">
         <w:r>
           <w:rPr>
             <w:rStyle w:val="Hyperlink"/>
             <w:color w:val="0169A9"/>
             <w:u w:val="single"/>
           </w:rPr>
-          <w:t xml:space="preserve">WizIOT's fuel monitoring systems</w:t>
+          <w:t xml:space="preserve">WizIOT's fleet fuel monitoring systems</w:t>
         </w:r>
       </w:hyperlink>
       <w:r>
@@ -5949,7 +5949,7 @@
         </w:rPr>
         <w:t xml:space="preserve">, or discover our ruggedized hardware lineup on the </w:t>
       </w:r>
-      <w:hyperlink w:history="1" r:id="rIdgdidsyzhup92stfn2uixc">
+      <w:hyperlink w:history="1" r:id="rIdxwtmvplnhwffkqqrd1l34">
         <w:r>
           <w:rPr>
             <w:rStyle w:val="Hyperlink"/>
@@ -6374,14 +6374,14 @@
         </w:rPr>
         <w:t xml:space="preserve">Protect remote generators and heavy machinery with </w:t>
       </w:r>
-      <w:hyperlink w:history="1" r:id="rIdybudnq2zs81tgjjdr8qaf">
+      <w:hyperlink w:history="1" r:id="rId-9xst6akisl7qcey3ywdt">
         <w:r>
           <w:rPr>
             <w:rStyle w:val="Hyperlink"/>
             <w:color w:val="0169A9"/>
             <w:u w:val="single"/>
           </w:rPr>
-          <w:t xml:space="preserve">WizIOT's fuel monitoring systems</w:t>
+          <w:t xml:space="preserve">WizIOT's industrial equipment monitoring</w:t>
         </w:r>
       </w:hyperlink>
       <w:r>
@@ -6392,7 +6392,7 @@
         </w:rPr>
         <w:t xml:space="preserve">, or speak directly with our </w:t>
       </w:r>
-      <w:hyperlink w:history="1" r:id="rIdtey1ngzff4xy4_yseqyk5">
+      <w:hyperlink w:history="1" r:id="rId6mlp2ezhky5vfet3-b3p5">
         <w:r>
           <w:rPr>
             <w:rStyle w:val="Hyperlink"/>
@@ -6817,14 +6817,14 @@
         </w:rPr>
         <w:t xml:space="preserve">Transform your fuel oversight into an automated operational asset by exploring </w:t>
       </w:r>
-      <w:hyperlink w:history="1" r:id="rIdz-009gpyqjlp51w1rtyyq">
+      <w:hyperlink w:history="1" r:id="rIds1aydr7voqichkopudmye">
         <w:r>
           <w:rPr>
             <w:rStyle w:val="Hyperlink"/>
             <w:color w:val="0169A9"/>
             <w:u w:val="single"/>
           </w:rPr>
-          <w:t xml:space="preserve">WizIOT's fuel level monitoring solutions</w:t>
+          <w:t xml:space="preserve">WizIOT's fuel telematics solutions</w:t>
         </w:r>
       </w:hyperlink>
       <w:r>
@@ -6835,7 +6835,7 @@
         </w:rPr>
         <w:t xml:space="preserve">, or review our </w:t>
       </w:r>
-      <w:hyperlink w:history="1" r:id="rIdhnjzf4nuoaupc_wyvf0po">
+      <w:hyperlink w:history="1" r:id="rIdo0gfu3i6h-y6musaxs9us">
         <w:r>
           <w:rPr>
             <w:rStyle w:val="Hyperlink"/>
@@ -7260,14 +7260,14 @@
         </w:rPr>
         <w:t xml:space="preserve">Achieving laboratory-grade fuel precision in the field requires engineered telemetry. Discover how </w:t>
       </w:r>
-      <w:hyperlink w:history="1" r:id="rIdq9trz7z7_yexfr75vbltg">
+      <w:hyperlink w:history="1" r:id="rIdffsqjthaepdzecyp2bmeq">
         <w:r>
           <w:rPr>
             <w:rStyle w:val="Hyperlink"/>
             <w:color w:val="0169A9"/>
             <w:u w:val="single"/>
           </w:rPr>
-          <w:t xml:space="preserve">WizIOT's precision fuel level monitoring systems</w:t>
+          <w:t xml:space="preserve">WizIOT's commercial telematics</w:t>
         </w:r>
       </w:hyperlink>
       <w:r>
@@ -7276,9 +7276,9 @@
           <w:sz w:val="21"/>
           <w:szCs w:val="21"/>
         </w:rPr>
-        <w:t xml:space="preserve"> implement motion-compensated fuel analytics, or </w:t>
-      </w:r>
-      <w:hyperlink w:history="1" r:id="rIdankamq0j4sxt_op_pq2gk">
+        <w:t xml:space="preserve"> implements motion-compensated fuel analytics, or </w:t>
+      </w:r>
+      <w:hyperlink w:history="1" r:id="rIdayn7qupsb-es3dwq4awgq">
         <w:r>
           <w:rPr>
             <w:rStyle w:val="Hyperlink"/>
@@ -7703,14 +7703,14 @@
         </w:rPr>
         <w:t xml:space="preserve">Protect your commercial fleet from night-time fuel shrinkage with </w:t>
       </w:r>
-      <w:hyperlink w:history="1" r:id="rId1mw-fzd7qyahugrpjbdev">
+      <w:hyperlink w:history="1" r:id="rIdqhdhligu7u3s44_ybvsqp">
         <w:r>
           <w:rPr>
             <w:rStyle w:val="Hyperlink"/>
             <w:color w:val="0169A9"/>
             <w:u w:val="single"/>
           </w:rPr>
-          <w:t xml:space="preserve">WizIOT's fuel theft detection solutions</w:t>
+          <w:t xml:space="preserve">WizIOT's fuel theft detection telematics</w:t>
         </w:r>
       </w:hyperlink>
       <w:r>
@@ -7721,7 +7721,7 @@
         </w:rPr>
         <w:t xml:space="preserve">. For technical hardware specifications and tamper alarm integrations, explore the </w:t>
       </w:r>
-      <w:hyperlink w:history="1" r:id="rIdkllpegak7tjik2g-7wmlv">
+      <w:hyperlink w:history="1" r:id="rIdjjbmhxfnartxe44zaojwh">
         <w:r>
           <w:rPr>
             <w:rStyle w:val="Hyperlink"/>
@@ -8146,14 +8146,14 @@
         </w:rPr>
         <w:t xml:space="preserve">Stop administrative leakage and station collusion with </w:t>
       </w:r>
-      <w:hyperlink w:history="1" r:id="rIdk5xb1psg2fe9z16g3qmlx">
+      <w:hyperlink w:history="1" r:id="rIdser_jexsp0ipaqbwznyom">
         <w:r>
           <w:rPr>
             <w:rStyle w:val="Hyperlink"/>
             <w:color w:val="0169A9"/>
             <w:u w:val="single"/>
           </w:rPr>
-          <w:t xml:space="preserve">WizIOT's advanced fuel theft detection software</w:t>
+          <w:t xml:space="preserve">WizIOT's advanced fleet auditing solutions</w:t>
         </w:r>
       </w:hyperlink>
       <w:r>
@@ -8164,7 +8164,7 @@
         </w:rPr>
         <w:t xml:space="preserve">. To see how automated inflow reconciliation works, </w:t>
       </w:r>
-      <w:hyperlink w:history="1" r:id="rIdg8g8ighr8uby4phepuufh">
+      <w:hyperlink w:history="1" r:id="rIdpy1g4c9n7kugvtsqt_1c9">
         <w:r>
           <w:rPr>
             <w:rStyle w:val="Hyperlink"/>
@@ -8589,7 +8589,7 @@
         </w:rPr>
         <w:t xml:space="preserve">Unlock real-time operational efficiency across your manufacturing and logistics assets with </w:t>
       </w:r>
-      <w:hyperlink w:history="1" r:id="rId5mtnk1wz3dvewmxiqskxo">
+      <w:hyperlink w:history="1" r:id="rIdneaduw_tzyeuilzhqgsr2">
         <w:r>
           <w:rPr>
             <w:rStyle w:val="Hyperlink"/>
@@ -8607,7 +8607,7 @@
         </w:rPr>
         <w:t xml:space="preserve">. To explore hardware connectivity options, review the </w:t>
       </w:r>
-      <w:hyperlink w:history="1" r:id="rId0fv2t6exwgeie-vgnluyf">
+      <w:hyperlink w:history="1" r:id="rIdvbsm4uexovbjynjvewkeh">
         <w:r>
           <w:rPr>
             <w:rStyle w:val="Hyperlink"/>
@@ -9032,7 +9032,7 @@
         </w:rPr>
         <w:t xml:space="preserve">Engineer your deployment for long-term industrial reliability. Explore </w:t>
       </w:r>
-      <w:hyperlink w:history="1" r:id="rId8gjxpnbbbekbkkracmjci">
+      <w:hyperlink w:history="1" r:id="rIdodxsl0rf_msd4edapiyim">
         <w:r>
           <w:rPr>
             <w:rStyle w:val="Hyperlink"/>
@@ -9050,7 +9050,7 @@
         </w:rPr>
         <w:t xml:space="preserve"> or </w:t>
       </w:r>
-      <w:hyperlink w:history="1" r:id="rIdxoqyqrrrqsuff3ab2xbq0">
+      <w:hyperlink w:history="1" r:id="rIdmwp3d1vvhutg08vzeugpn">
         <w:r>
           <w:rPr>
             <w:rStyle w:val="Hyperlink"/>
@@ -9475,7 +9475,7 @@
         </w:rPr>
         <w:t xml:space="preserve">Discover how the </w:t>
       </w:r>
-      <w:hyperlink w:history="1" r:id="rIdtbimoe6vs5l_jnmvar4m-">
+      <w:hyperlink w:history="1" r:id="rId_27urlnzdyypzzlxhs6rc">
         <w:r>
           <w:rPr>
             <w:rStyle w:val="Hyperlink"/>
@@ -9493,7 +9493,7 @@
         </w:rPr>
         <w:t xml:space="preserve"> delivers elastic scalability and automated event processing, or check our </w:t>
       </w:r>
-      <w:hyperlink w:history="1" r:id="rIduwaoijvtplviw1vvtdlib">
+      <w:hyperlink w:history="1" r:id="rId6ghqqixf2fyl7fxle-8mo">
         <w:r>
           <w:rPr>
             <w:rStyle w:val="Hyperlink"/>
@@ -9918,7 +9918,7 @@
         </w:rPr>
         <w:t xml:space="preserve">Move your industrial projects out of the pilot phase with confidence. Learn how the </w:t>
       </w:r>
-      <w:hyperlink w:history="1" r:id="rIdfcv72uoy_qgj690wrkbzs">
+      <w:hyperlink w:history="1" r:id="rIdb06gt1blppk6pgmb4foj_">
         <w:r>
           <w:rPr>
             <w:rStyle w:val="Hyperlink"/>
@@ -9936,7 +9936,7 @@
         </w:rPr>
         <w:t xml:space="preserve"> streamlines enterprise device deployment, or </w:t>
       </w:r>
-      <w:hyperlink w:history="1" r:id="rId50uxf9oycsg1jk3jnaxoq">
+      <w:hyperlink w:history="1" r:id="rIdzk3pk9v0xh_7x-lkitwwb">
         <w:r>
           <w:rPr>
             <w:rStyle w:val="Hyperlink"/>
@@ -10361,7 +10361,7 @@
         </w:rPr>
         <w:t xml:space="preserve">Eliminate expensive field service truck rolls by deploying </w:t>
       </w:r>
-      <w:hyperlink w:history="1" r:id="rIdw2vocptm6wezcge4uiyru">
+      <w:hyperlink w:history="1" r:id="rIdz8goelsijj8lq0zfvhr-r">
         <w:r>
           <w:rPr>
             <w:rStyle w:val="Hyperlink"/>
@@ -10379,7 +10379,7 @@
         </w:rPr>
         <w:t xml:space="preserve">. To discuss fleet-wide firmware deployment strategies, </w:t>
       </w:r>
-      <w:hyperlink w:history="1" r:id="rIdsnwktrlepnh4a2wynmzii">
+      <w:hyperlink w:history="1" r:id="rIdqmvp0mjxapp6di0mk_erx">
         <w:r>
           <w:rPr>
             <w:rStyle w:val="Hyperlink"/>
@@ -10804,7 +10804,7 @@
         </w:rPr>
         <w:t xml:space="preserve">Safeguard your mission-critical operations with enterprise security engineering. Discover how </w:t>
       </w:r>
-      <w:hyperlink w:history="1" r:id="rId58uir_edvpwbx9reebhuj">
+      <w:hyperlink w:history="1" r:id="rId-soqtvhlgdyp9ex9im7ek">
         <w:r>
           <w:rPr>
             <w:rStyle w:val="Hyperlink"/>
@@ -10822,7 +10822,7 @@
         </w:rPr>
         <w:t xml:space="preserve"> enforces zero-trust device management, or review our </w:t>
       </w:r>
-      <w:hyperlink w:history="1" r:id="rIdvajrpz2zapl-q9_bqfcph">
+      <w:hyperlink w:history="1" r:id="rIdlvkwv-hhp7on18f1fbnd9">
         <w:r>
           <w:rPr>
             <w:rStyle w:val="Hyperlink"/>
@@ -11247,7 +11247,7 @@
         </w:rPr>
         <w:t xml:space="preserve">Protect your high-value yellow iron assets and streamline job site productivity. Discover </w:t>
       </w:r>
-      <w:hyperlink w:history="1" r:id="rIdcvzkohmxuzp4offbzxvlq">
+      <w:hyperlink w:history="1" r:id="rIdzlt1t0eoq4mnwph5zhehq">
         <w:r>
           <w:rPr>
             <w:rStyle w:val="Hyperlink"/>
@@ -11265,7 +11265,7 @@
         </w:rPr>
         <w:t xml:space="preserve">, or review our </w:t>
       </w:r>
-      <w:hyperlink w:history="1" r:id="rIdzfmvsbbrnhcksxawekn7y">
+      <w:hyperlink w:history="1" r:id="rIdrpb-1o4qvoprjirlyohwj">
         <w:r>
           <w:rPr>
             <w:rStyle w:val="Hyperlink"/>
@@ -11690,7 +11690,7 @@
         </w:rPr>
         <w:t xml:space="preserve">Maintain cold chain integrity and streamline temperature compliance with </w:t>
       </w:r>
-      <w:hyperlink w:history="1" r:id="rIdfl83-yudlwefzpdrmu-m9">
+      <w:hyperlink w:history="1" r:id="rIdfgt4b9jxm_zth4tbndtpj">
         <w:r>
           <w:rPr>
             <w:rStyle w:val="Hyperlink"/>
@@ -11708,7 +11708,7 @@
         </w:rPr>
         <w:t xml:space="preserve">. For enterprise fleet deployment options, visit the </w:t>
       </w:r>
-      <w:hyperlink w:history="1" r:id="rIdavrpqs_egyqhfdj2w54wc">
+      <w:hyperlink w:history="1" r:id="rIdqyurzzr1p-eoxm9eanopx">
         <w:r>
           <w:rPr>
             <w:rStyle w:val="Hyperlink"/>
@@ -12133,7 +12133,7 @@
         </w:rPr>
         <w:t xml:space="preserve">Take control of rising facility power costs with </w:t>
       </w:r>
-      <w:hyperlink w:history="1" r:id="rIde0a3ixhe52sieeuomjymv">
+      <w:hyperlink w:history="1" r:id="rIde8j3b_ghm7mf5j91xq9tx">
         <w:r>
           <w:rPr>
             <w:rStyle w:val="Hyperlink"/>
@@ -12151,7 +12151,7 @@
         </w:rPr>
         <w:t xml:space="preserve">. To explore hardware specifications and energy analytics dashboards, visit the </w:t>
       </w:r>
-      <w:hyperlink w:history="1" r:id="rId06qqkdf3lj7yoi7mdvfr1">
+      <w:hyperlink w:history="1" r:id="rIddiylzlzlrhyxan_gtaz3l">
         <w:r>
           <w:rPr>
             <w:rStyle w:val="Hyperlink"/>
@@ -12576,7 +12576,7 @@
         </w:rPr>
         <w:t xml:space="preserve">Uncover hidden operational waste across your facilities. Explore how </w:t>
       </w:r>
-      <w:hyperlink w:history="1" r:id="rIdyyr6riy1ydrgxtwo-2c5r">
+      <w:hyperlink w:history="1" r:id="rIdqnt_kvwjm718gl0vrzcau">
         <w:r>
           <w:rPr>
             <w:rStyle w:val="Hyperlink"/>
@@ -12594,7 +12594,7 @@
         </w:rPr>
         <w:t xml:space="preserve"> power granular sub-metering, or </w:t>
       </w:r>
-      <w:hyperlink w:history="1" r:id="rIdo1m9gj5qgva2t-arv86af">
+      <w:hyperlink w:history="1" r:id="rIdkqsps9zdrqtszqtnnuye9">
         <w:r>
           <w:rPr>
             <w:rStyle w:val="Hyperlink"/>
@@ -13019,7 +13019,7 @@
         </w:rPr>
         <w:t xml:space="preserve">Turn raw electrical metrics into actionable financial savings. Discover how </w:t>
       </w:r>
-      <w:hyperlink w:history="1" r:id="rIdrp09paltuxt_hg34isuui">
+      <w:hyperlink w:history="1" r:id="rIdukittbgrixjzkgcna3dow">
         <w:r>
           <w:rPr>
             <w:rStyle w:val="Hyperlink"/>
@@ -13037,7 +13037,7 @@
         </w:rPr>
         <w:t xml:space="preserve"> delivers enterprise energy management, or review our </w:t>
       </w:r>
-      <w:hyperlink w:history="1" r:id="rIdcgojgloqtzh2ihtqvnfla">
+      <w:hyperlink w:history="1" r:id="rId02nxsi4-pkldpyidojgej">
         <w:r>
           <w:rPr>
             <w:rStyle w:val="Hyperlink"/>
@@ -13462,7 +13462,7 @@
         </w:rPr>
         <w:t xml:space="preserve">Eliminate costly utility demand penalties with automated peak shaving. Explore </w:t>
       </w:r>
-      <w:hyperlink w:history="1" r:id="rIdskw2ntqx3vdzs3y7cflyu">
+      <w:hyperlink w:history="1" r:id="rIdgyeulzjgmu_betijhoebx">
         <w:r>
           <w:rPr>
             <w:rStyle w:val="Hyperlink"/>
@@ -13480,7 +13480,7 @@
         </w:rPr>
         <w:t xml:space="preserve">, or </w:t>
       </w:r>
-      <w:hyperlink w:history="1" r:id="rId7ezhqdwye5wrdzwoobopc">
+      <w:hyperlink w:history="1" r:id="rIdjvhxr8x508zvbig3smibp">
         <w:r>
           <w:rPr>
             <w:rStyle w:val="Hyperlink"/>
@@ -13905,7 +13905,7 @@
         </w:rPr>
         <w:t xml:space="preserve">Maximize the operational lifespan and range of your electric commercial fleet. Explore </w:t>
       </w:r>
-      <w:hyperlink w:history="1" r:id="rIdmgcctw0jikdoe6wbzfunf">
+      <w:hyperlink w:history="1" r:id="rIdpse33b3w4e14txre2hcka">
         <w:r>
           <w:rPr>
             <w:rStyle w:val="Hyperlink"/>
@@ -13923,7 +13923,7 @@
         </w:rPr>
         <w:t xml:space="preserve">, or review our </w:t>
       </w:r>
-      <w:hyperlink w:history="1" r:id="rIdf4ro1ihlabszejvfxy7jp">
+      <w:hyperlink w:history="1" r:id="rIdszoy5pwga1wz0exbtk4f3">
         <w:r>
           <w:rPr>
             <w:rStyle w:val="Hyperlink"/>
@@ -14348,7 +14348,7 @@
         </w:rPr>
         <w:t xml:space="preserve">Safeguard high-value battery packs and maximize pack longevity. Discover how </w:t>
       </w:r>
-      <w:hyperlink w:history="1" r:id="rIduq2zyg0e604eslautfbpw">
+      <w:hyperlink w:history="1" r:id="rId3scrbak5qehnm3jq7rtpk">
         <w:r>
           <w:rPr>
             <w:rStyle w:val="Hyperlink"/>
@@ -14366,7 +14366,7 @@
         </w:rPr>
         <w:t xml:space="preserve"> provide deep cell analytics, or </w:t>
       </w:r>
-      <w:hyperlink w:history="1" r:id="rIdxuel3bpnvjcfrd38vau8r">
+      <w:hyperlink w:history="1" r:id="rId0dntwb97ikzwqbd-zkztv">
         <w:r>
           <w:rPr>
             <w:rStyle w:val="Hyperlink"/>
@@ -14791,7 +14791,7 @@
         </w:rPr>
         <w:t xml:space="preserve">Protect high-density energy storage investments with mission-critical monitoring. Explore </w:t>
       </w:r>
-      <w:hyperlink w:history="1" r:id="rIdzozh940go98djqssqj8ds">
+      <w:hyperlink w:history="1" r:id="rIdvfnwsohypdtypkr34zrx7">
         <w:r>
           <w:rPr>
             <w:rStyle w:val="Hyperlink"/>
@@ -14809,7 +14809,7 @@
         </w:rPr>
         <w:t xml:space="preserve"> or learn how our </w:t>
       </w:r>
-      <w:hyperlink w:history="1" r:id="rIdhtv__vdtmwk0txpk0axwv">
+      <w:hyperlink w:history="1" r:id="rIdg_wb2t7x5kk45eoibpfx6">
         <w:r>
           <w:rPr>
             <w:rStyle w:val="Hyperlink"/>
@@ -15234,7 +15234,7 @@
         </w:rPr>
         <w:t xml:space="preserve">Maximize the commercial returns of your energy storage portfolio. Discover how </w:t>
       </w:r>
-      <w:hyperlink w:history="1" r:id="rIdl512dce7insyku_lzec0r">
+      <w:hyperlink w:history="1" r:id="rIdatyri6wvhvqn3by2otxze">
         <w:r>
           <w:rPr>
             <w:rStyle w:val="Hyperlink"/>
@@ -15252,7 +15252,7 @@
         </w:rPr>
         <w:t xml:space="preserve"> balance revenue generation with cell health, or </w:t>
       </w:r>
-      <w:hyperlink w:history="1" r:id="rIds59tiez9f74fpopv7bcww">
+      <w:hyperlink w:history="1" r:id="rIdy9ddqewvu-nf4shta6hhw">
         <w:r>
           <w:rPr>
             <w:rStyle w:val="Hyperlink"/>
@@ -15677,7 +15677,7 @@
         </w:rPr>
         <w:t xml:space="preserve">Maximize generation yield across your commercial solar assets. Discover how </w:t>
       </w:r>
-      <w:hyperlink w:history="1" r:id="rId9dyryravts3008ephhayy">
+      <w:hyperlink w:history="1" r:id="rId435bav8e9nysp49we5cl1">
         <w:r>
           <w:rPr>
             <w:rStyle w:val="Hyperlink"/>
@@ -15695,7 +15695,7 @@
         </w:rPr>
         <w:t xml:space="preserve"> empower commercial solar monitoring, or explore the </w:t>
       </w:r>
-      <w:hyperlink w:history="1" r:id="rId7qhybvrffvnfjjuqv5wvy">
+      <w:hyperlink w:history="1" r:id="rIdir61rv_ylcv8qhvgl76yg">
         <w:r>
           <w:rPr>
             <w:rStyle w:val="Hyperlink"/>
@@ -16120,7 +16120,7 @@
         </w:rPr>
         <w:t xml:space="preserve">Optimize solar generation efficiency and eliminate unnecessary maintenance costs. Explore </w:t>
       </w:r>
-      <w:hyperlink w:history="1" r:id="rIdyepol0yl66ifh03ehoiyj">
+      <w:hyperlink w:history="1" r:id="rIdob7wnb6tre-xjfyiyfh1f">
         <w:r>
           <w:rPr>
             <w:rStyle w:val="Hyperlink"/>
@@ -16138,7 +16138,7 @@
         </w:rPr>
         <w:t xml:space="preserve"> or </w:t>
       </w:r>
-      <w:hyperlink w:history="1" r:id="rIdypehomwzff6lpz92_77yl">
+      <w:hyperlink w:history="1" r:id="rIdzkofnjce61e_6rahfyos9">
         <w:r>
           <w:rPr>
             <w:rStyle w:val="Hyperlink"/>
@@ -16563,7 +16563,7 @@
         </w:rPr>
         <w:t xml:space="preserve">Ensure 99.999% uptime across your distributed infrastructure. Discover how </w:t>
       </w:r>
-      <w:hyperlink w:history="1" r:id="rIdatvxashkpmju9hnj6jezh">
+      <w:hyperlink w:history="1" r:id="rIdgcyrgtn_bd0rmg2ls_pfj">
         <w:r>
           <w:rPr>
             <w:rStyle w:val="Hyperlink"/>
@@ -16581,7 +16581,7 @@
         </w:rPr>
         <w:t xml:space="preserve"> protect unmanned facilities, or explore our </w:t>
       </w:r>
-      <w:hyperlink w:history="1" r:id="rId1tng8dheom8t1gxsrd9lf">
+      <w:hyperlink w:history="1" r:id="rIdt7mowfkeh4xf2t-40d9ml">
         <w:r>
           <w:rPr>
             <w:rStyle w:val="Hyperlink"/>
@@ -17006,7 +17006,7 @@
         </w:rPr>
         <w:t xml:space="preserve">Optimize complex hybrid microgrids for maximum fuel savings and rock-solid reliability. Learn how </w:t>
       </w:r>
-      <w:hyperlink w:history="1" r:id="rIdkj7pm5smgraki_mmhzo4p">
+      <w:hyperlink w:history="1" r:id="rIdjc3unxkyhxzclndv7e6nj">
         <w:r>
           <w:rPr>
             <w:rStyle w:val="Hyperlink"/>
@@ -17024,7 +17024,7 @@
         </w:rPr>
         <w:t xml:space="preserve"> orchestrate hybrid power, or </w:t>
       </w:r>
-      <w:hyperlink w:history="1" r:id="rIdz5vdemejnhdoxakrvdjfz">
+      <w:hyperlink w:history="1" r:id="rIdoeejnjsi7gkpuwqbxjy6p">
         <w:r>
           <w:rPr>
             <w:rStyle w:val="Hyperlink"/>
@@ -17449,7 +17449,7 @@
         </w:rPr>
         <w:t xml:space="preserve">Eliminate asset loss and maximize fleet utilization across your supply chain. Explore </w:t>
       </w:r>
-      <w:hyperlink w:history="1" r:id="rIdlcl254mixwh4pqgwk92hp">
+      <w:hyperlink w:history="1" r:id="rIdx7wmvkxnjtfdsk10phjwc">
         <w:r>
           <w:rPr>
             <w:rStyle w:val="Hyperlink"/>
@@ -17467,7 +17467,7 @@
         </w:rPr>
         <w:t xml:space="preserve">, or review our </w:t>
       </w:r>
-      <w:hyperlink w:history="1" r:id="rIdhhweuw8f-vv0f4exh4kuq">
+      <w:hyperlink w:history="1" r:id="rIdss9zdetuab0z3dumeltlm">
         <w:r>
           <w:rPr>
             <w:rStyle w:val="Hyperlink"/>
@@ -17892,7 +17892,7 @@
         </w:rPr>
         <w:t xml:space="preserve">Design the optimal tracking hardware architecture for your operational assets. Explore </w:t>
       </w:r>
-      <w:hyperlink w:history="1" r:id="rIdl3xvszvecjifmkwbj9oww">
+      <w:hyperlink w:history="1" r:id="rId0rs18mrbg49aqaarablod">
         <w:r>
           <w:rPr>
             <w:rStyle w:val="Hyperlink"/>
@@ -17910,7 +17910,7 @@
         </w:rPr>
         <w:t xml:space="preserve">, or </w:t>
       </w:r>
-      <w:hyperlink w:history="1" r:id="rIdsafmcv7bgnxgpecog9tuq">
+      <w:hyperlink w:history="1" r:id="rIdqfnyuejhp0blohqb7j9b-">
         <w:r>
           <w:rPr>
             <w:rStyle w:val="Hyperlink"/>
@@ -18335,7 +18335,7 @@
         </w:rPr>
         <w:t xml:space="preserve">Protect your high-liability and mission-critical operations with sub-second visibility. Discover how </w:t>
       </w:r>
-      <w:hyperlink w:history="1" r:id="rIdex1tg96fputxgyijlrj1j">
+      <w:hyperlink w:history="1" r:id="rIdo08m3kdb3kkelmdndsepv">
         <w:r>
           <w:rPr>
             <w:rStyle w:val="Hyperlink"/>
@@ -18353,7 +18353,7 @@
         </w:rPr>
         <w:t xml:space="preserve"> powers emergency response, or explore our </w:t>
       </w:r>
-      <w:hyperlink w:history="1" r:id="rIdiynhfx9up6jmszfu_hkck">
+      <w:hyperlink w:history="1" r:id="rIdnodi4n3kwj30b5_sumuqr">
         <w:r>
           <w:rPr>
             <w:rStyle w:val="Hyperlink"/>
@@ -18778,7 +18778,7 @@
         </w:rPr>
         <w:t xml:space="preserve">Transform complex telematics data streams into intuitive operational command dashboards. Explore the </w:t>
       </w:r>
-      <w:hyperlink w:history="1" r:id="rIdwvfforhkjmlp6xmrmb9_r">
+      <w:hyperlink w:history="1" r:id="rId2wmecffe6myvjdnwft9ei">
         <w:r>
           <w:rPr>
             <w:rStyle w:val="Hyperlink"/>
@@ -18796,7 +18796,7 @@
         </w:rPr>
         <w:t xml:space="preserve">, or </w:t>
       </w:r>
-      <w:hyperlink w:history="1" r:id="rIdkmjjmvj0qr3ykpyi3c3sb">
+      <w:hyperlink w:history="1" r:id="rIden_8g3hpu0-z4raloqe3h">
         <w:r>
           <w:rPr>
             <w:rStyle w:val="Hyperlink"/>

</xml_diff>